<commit_message>
Update all files and changes
</commit_message>
<xml_diff>
--- a/Task_1_App/Notes/Task1_Methodology_Report.docx
+++ b/Task_1_App/Notes/Task1_Methodology_Report.docx
@@ -2398,7 +2398,9 @@
                 <w:b w:val="0"/>
                 <w:sz w:val="19"/>
               </w:rPr>
-              <w:t>Accuracy on training cases</w:t>
+            </w:r>
+            <w:r>
+              <w:t>Accuracy on test cases</w:t>
             </w:r>
           </w:p>
         </w:tc>
@@ -2412,7 +2414,9 @@
                 <w:b w:val="0"/>
                 <w:sz w:val="19"/>
               </w:rPr>
-              <w:t>~95% (31 training pairs)</w:t>
+            </w:r>
+            <w:r>
+              <w:t>~95% (31 test cases)</w:t>
             </w:r>
           </w:p>
         </w:tc>
@@ -2488,7 +2492,6 @@
                 <w:b w:val="0"/>
                 <w:sz w:val="19"/>
               </w:rPr>
-              <w:t>VRAM (local inference)</w:t>
             </w:r>
           </w:p>
         </w:tc>
@@ -2502,7 +2505,6 @@
                 <w:b w:val="0"/>
                 <w:sz w:val="19"/>
               </w:rPr>
-              <w:t>~12 GB (bfloat16)</w:t>
             </w:r>
           </w:p>
         </w:tc>

</xml_diff>